<commit_message>
Day 1 Finished (Exam)
Day 1 finished in college
</commit_message>
<xml_diff>
--- a/Task 1/Task 1a/Task1_Proposal_RegistrationNumber__Naser_A.docx
+++ b/Task 1/Task 1a/Task1_Proposal_RegistrationNumber__Naser_A.docx
@@ -302,7 +302,7 @@
           <w:r>
             <w:fldChar w:fldCharType="separate"/>
           </w:r>
-          <w:hyperlink w:anchor="_Toc223956243" w:history="1">
+          <w:hyperlink w:anchor="_Toc223961286" w:history="1">
             <w:r>
               <w:rPr>
                 <w:rStyle w:val="Hyperlink"/>
@@ -329,7 +329,7 @@
                 <w:noProof/>
                 <w:webHidden/>
               </w:rPr>
-              <w:instrText xml:space="preserve"> PAGEREF _Toc223956243 \h </w:instrText>
+              <w:instrText xml:space="preserve"> PAGEREF _Toc223961286 \h </w:instrText>
             </w:r>
             <w:r>
               <w:rPr>
@@ -372,7 +372,7 @@
               <w:lang w:eastAsia="en-GB"/>
             </w:rPr>
           </w:pPr>
-          <w:hyperlink w:anchor="_Toc223956244" w:history="1">
+          <w:hyperlink w:anchor="_Toc223961287" w:history="1">
             <w:r>
               <w:rPr>
                 <w:rStyle w:val="Hyperlink"/>
@@ -399,7 +399,7 @@
                 <w:noProof/>
                 <w:webHidden/>
               </w:rPr>
-              <w:instrText xml:space="preserve"> PAGEREF _Toc223956244 \h </w:instrText>
+              <w:instrText xml:space="preserve"> PAGEREF _Toc223961287 \h </w:instrText>
             </w:r>
             <w:r>
               <w:rPr>
@@ -442,7 +442,7 @@
               <w:lang w:eastAsia="en-GB"/>
             </w:rPr>
           </w:pPr>
-          <w:hyperlink w:anchor="_Toc223956245" w:history="1">
+          <w:hyperlink w:anchor="_Toc223961288" w:history="1">
             <w:r>
               <w:rPr>
                 <w:rStyle w:val="Hyperlink"/>
@@ -469,7 +469,7 @@
                 <w:noProof/>
                 <w:webHidden/>
               </w:rPr>
-              <w:instrText xml:space="preserve"> PAGEREF _Toc223956245 \h </w:instrText>
+              <w:instrText xml:space="preserve"> PAGEREF _Toc223961288 \h </w:instrText>
             </w:r>
             <w:r>
               <w:rPr>
@@ -512,7 +512,7 @@
               <w:lang w:eastAsia="en-GB"/>
             </w:rPr>
           </w:pPr>
-          <w:hyperlink w:anchor="_Toc223956246" w:history="1">
+          <w:hyperlink w:anchor="_Toc223961289" w:history="1">
             <w:r>
               <w:rPr>
                 <w:rStyle w:val="Hyperlink"/>
@@ -539,7 +539,7 @@
                 <w:noProof/>
                 <w:webHidden/>
               </w:rPr>
-              <w:instrText xml:space="preserve"> PAGEREF _Toc223956246 \h </w:instrText>
+              <w:instrText xml:space="preserve"> PAGEREF _Toc223961289 \h </w:instrText>
             </w:r>
             <w:r>
               <w:rPr>
@@ -559,7 +559,7 @@
                 <w:noProof/>
                 <w:webHidden/>
               </w:rPr>
-              <w:t>5</w:t>
+              <w:t>6</w:t>
             </w:r>
             <w:r>
               <w:rPr>
@@ -582,7 +582,7 @@
               <w:lang w:eastAsia="en-GB"/>
             </w:rPr>
           </w:pPr>
-          <w:hyperlink w:anchor="_Toc223956247" w:history="1">
+          <w:hyperlink w:anchor="_Toc223961290" w:history="1">
             <w:r>
               <w:rPr>
                 <w:rStyle w:val="Hyperlink"/>
@@ -609,7 +609,7 @@
                 <w:noProof/>
                 <w:webHidden/>
               </w:rPr>
-              <w:instrText xml:space="preserve"> PAGEREF _Toc223956247 \h </w:instrText>
+              <w:instrText xml:space="preserve"> PAGEREF _Toc223961290 \h </w:instrText>
             </w:r>
             <w:r>
               <w:rPr>
@@ -629,7 +629,7 @@
                 <w:noProof/>
                 <w:webHidden/>
               </w:rPr>
-              <w:t>6</w:t>
+              <w:t>7</w:t>
             </w:r>
             <w:r>
               <w:rPr>
@@ -652,7 +652,7 @@
               <w:lang w:eastAsia="en-GB"/>
             </w:rPr>
           </w:pPr>
-          <w:hyperlink w:anchor="_Toc223956248" w:history="1">
+          <w:hyperlink w:anchor="_Toc223961291" w:history="1">
             <w:r>
               <w:rPr>
                 <w:rStyle w:val="Hyperlink"/>
@@ -679,7 +679,7 @@
                 <w:noProof/>
                 <w:webHidden/>
               </w:rPr>
-              <w:instrText xml:space="preserve"> PAGEREF _Toc223956248 \h </w:instrText>
+              <w:instrText xml:space="preserve"> PAGEREF _Toc223961291 \h </w:instrText>
             </w:r>
             <w:r>
               <w:rPr>
@@ -699,7 +699,7 @@
                 <w:noProof/>
                 <w:webHidden/>
               </w:rPr>
-              <w:t>8</w:t>
+              <w:t>9</w:t>
             </w:r>
             <w:r>
               <w:rPr>
@@ -722,7 +722,7 @@
               <w:lang w:eastAsia="en-GB"/>
             </w:rPr>
           </w:pPr>
-          <w:hyperlink w:anchor="_Toc223956249" w:history="1">
+          <w:hyperlink w:anchor="_Toc223961292" w:history="1">
             <w:r>
               <w:rPr>
                 <w:rStyle w:val="Hyperlink"/>
@@ -749,7 +749,7 @@
                 <w:noProof/>
                 <w:webHidden/>
               </w:rPr>
-              <w:instrText xml:space="preserve"> PAGEREF _Toc223956249 \h </w:instrText>
+              <w:instrText xml:space="preserve"> PAGEREF _Toc223961292 \h </w:instrText>
             </w:r>
             <w:r>
               <w:rPr>
@@ -769,7 +769,7 @@
                 <w:noProof/>
                 <w:webHidden/>
               </w:rPr>
-              <w:t>8</w:t>
+              <w:t>10</w:t>
             </w:r>
             <w:r>
               <w:rPr>
@@ -792,7 +792,7 @@
               <w:lang w:eastAsia="en-GB"/>
             </w:rPr>
           </w:pPr>
-          <w:hyperlink w:anchor="_Toc223956250" w:history="1">
+          <w:hyperlink w:anchor="_Toc223961293" w:history="1">
             <w:r>
               <w:rPr>
                 <w:rStyle w:val="Hyperlink"/>
@@ -819,7 +819,7 @@
                 <w:noProof/>
                 <w:webHidden/>
               </w:rPr>
-              <w:instrText xml:space="preserve"> PAGEREF _Toc223956250 \h </w:instrText>
+              <w:instrText xml:space="preserve"> PAGEREF _Toc223961293 \h </w:instrText>
             </w:r>
             <w:r>
               <w:rPr>
@@ -839,7 +839,7 @@
                 <w:noProof/>
                 <w:webHidden/>
               </w:rPr>
-              <w:t>9</w:t>
+              <w:t>10</w:t>
             </w:r>
             <w:r>
               <w:rPr>
@@ -862,7 +862,7 @@
               <w:lang w:eastAsia="en-GB"/>
             </w:rPr>
           </w:pPr>
-          <w:hyperlink w:anchor="_Toc223956251" w:history="1">
+          <w:hyperlink w:anchor="_Toc223961294" w:history="1">
             <w:r>
               <w:rPr>
                 <w:rStyle w:val="Hyperlink"/>
@@ -889,7 +889,7 @@
                 <w:noProof/>
                 <w:webHidden/>
               </w:rPr>
-              <w:instrText xml:space="preserve"> PAGEREF _Toc223956251 \h </w:instrText>
+              <w:instrText xml:space="preserve"> PAGEREF _Toc223961294 \h </w:instrText>
             </w:r>
             <w:r>
               <w:rPr>
@@ -909,7 +909,7 @@
                 <w:noProof/>
                 <w:webHidden/>
               </w:rPr>
-              <w:t>9</w:t>
+              <w:t>10</w:t>
             </w:r>
             <w:r>
               <w:rPr>
@@ -932,7 +932,7 @@
               <w:lang w:eastAsia="en-GB"/>
             </w:rPr>
           </w:pPr>
-          <w:hyperlink w:anchor="_Toc223956252" w:history="1">
+          <w:hyperlink w:anchor="_Toc223961295" w:history="1">
             <w:r>
               <w:rPr>
                 <w:rStyle w:val="Hyperlink"/>
@@ -959,7 +959,7 @@
                 <w:noProof/>
                 <w:webHidden/>
               </w:rPr>
-              <w:instrText xml:space="preserve"> PAGEREF _Toc223956252 \h </w:instrText>
+              <w:instrText xml:space="preserve"> PAGEREF _Toc223961295 \h </w:instrText>
             </w:r>
             <w:r>
               <w:rPr>
@@ -979,7 +979,7 @@
                 <w:noProof/>
                 <w:webHidden/>
               </w:rPr>
-              <w:t>10</w:t>
+              <w:t>11</w:t>
             </w:r>
             <w:r>
               <w:rPr>
@@ -1024,7 +1024,7 @@
       <w:pPr>
         <w:pStyle w:val="Heading1"/>
       </w:pPr>
-      <w:bookmarkStart w:id="0" w:name="_Toc223956243"/>
+      <w:bookmarkStart w:id="0" w:name="_Toc223961286"/>
       <w:r>
         <w:lastRenderedPageBreak/>
         <w:t>Research</w:t>
@@ -1035,12 +1035,12 @@
     <w:p/>
     <w:p>
       <w:r>
-        <w:t>Planetorganic.com</w:t>
+        <w:t>robertsfarmshop.co.uk</w:t>
       </w:r>
     </w:p>
     <w:p>
       <w:r>
-        <w:t>Openfoodnetwork.org</w:t>
+        <w:t>www.beckettsfarm.co.uk</w:t>
       </w:r>
     </w:p>
     <w:p>
@@ -1077,7 +1077,7 @@
       <w:pPr>
         <w:pStyle w:val="Heading1"/>
       </w:pPr>
-      <w:bookmarkStart w:id="1" w:name="_Toc223956244"/>
+      <w:bookmarkStart w:id="1" w:name="_Toc223961287"/>
       <w:r>
         <w:lastRenderedPageBreak/>
         <w:t>Business Context</w:t>
@@ -1120,7 +1120,7 @@
           <w:rFonts w:ascii="Calibri" w:hAnsi="Calibri" w:cs="Calibri"/>
           <w:color w:val="0D0D0D" w:themeColor="text1" w:themeTint="F2"/>
         </w:rPr>
-        <w:t>Greenfield Local Hub, the client, would like that the digital solution provides</w:t>
+        <w:t>Many competitors</w:t>
       </w:r>
       <w:r>
         <w:rPr>
@@ -1134,56 +1134,64 @@
           <w:rFonts w:ascii="Calibri" w:hAnsi="Calibri" w:cs="Calibri"/>
           <w:color w:val="0D0D0D" w:themeColor="text1" w:themeTint="F2"/>
         </w:rPr>
-        <w:t>information about the producers, their methods and the benefits of buying locally</w:t>
+        <w:t xml:space="preserve">in the local farming and food producing industry fail to provide essential and necessary information in their </w:t>
       </w:r>
       <w:r>
         <w:rPr>
           <w:rFonts w:ascii="Calibri" w:hAnsi="Calibri" w:cs="Calibri"/>
           <w:color w:val="0D0D0D" w:themeColor="text1" w:themeTint="F2"/>
         </w:rPr>
-        <w:t xml:space="preserve">. </w:t>
+        <w:t>digital solution</w:t>
       </w:r>
       <w:r>
         <w:rPr>
           <w:rFonts w:ascii="Calibri" w:hAnsi="Calibri" w:cs="Calibri"/>
           <w:color w:val="0D0D0D" w:themeColor="text1" w:themeTint="F2"/>
         </w:rPr>
-        <w:t xml:space="preserve">After researching </w:t>
+        <w:t xml:space="preserve">. Most of them never mention specifically who the producers </w:t>
       </w:r>
-    </w:p>
-    <w:p>
-      <w:pPr>
-        <w:pStyle w:val="Subtitle"/>
+      <w:r>
         <w:rPr>
           <w:rFonts w:ascii="Calibri" w:hAnsi="Calibri" w:cs="Calibri"/>
           <w:color w:val="0D0D0D" w:themeColor="text1" w:themeTint="F2"/>
         </w:rPr>
-      </w:pPr>
-    </w:p>
-    <w:p>
-      <w:pPr>
-        <w:pStyle w:val="Subtitle"/>
+        <w:t xml:space="preserve">of the products </w:t>
+      </w:r>
+      <w:r>
         <w:rPr>
           <w:rFonts w:ascii="Calibri" w:hAnsi="Calibri" w:cs="Calibri"/>
           <w:color w:val="0D0D0D" w:themeColor="text1" w:themeTint="F2"/>
         </w:rPr>
-      </w:pPr>
+        <w:t xml:space="preserve">are, as well as the methods they have used and </w:t>
+      </w:r>
       <w:r>
         <w:rPr>
           <w:rFonts w:ascii="Calibri" w:hAnsi="Calibri" w:cs="Calibri"/>
           <w:color w:val="0D0D0D" w:themeColor="text1" w:themeTint="F2"/>
         </w:rPr>
-        <w:t xml:space="preserve">Customers would like to know who produced the food that are being sold before making any purchase, they want to know how the products were grown or made as well. Customers should also know what are the </w:t>
+        <w:t xml:space="preserve">they also fail to bring up all the benefits of buying locally. Therefore, the client, Greenfield Local Hub has requested for the digital solution to include all the important information needed. This is in order for customers to have a more in-depth idea of the local hub and what they strive for, but also to convey a message to </w:t>
       </w:r>
-      <w:proofErr w:type="spellStart"/>
       <w:r>
         <w:rPr>
           <w:rFonts w:ascii="Calibri" w:hAnsi="Calibri" w:cs="Calibri"/>
           <w:color w:val="0D0D0D" w:themeColor="text1" w:themeTint="F2"/>
         </w:rPr>
-        <w:t>bef</w:t>
+        <w:t>society on how we must support the locals to boost the economy so the money stays within the community. By buying locally, it supports small businesses and new jobs are created, it also helps the environment by reducing transport emissions.</w:t>
       </w:r>
-      <w:proofErr w:type="spellEnd"/>
+      <w:r>
+        <w:rPr>
+          <w:rFonts w:ascii="Calibri" w:hAnsi="Calibri" w:cs="Calibri"/>
+          <w:color w:val="0D0D0D" w:themeColor="text1" w:themeTint="F2"/>
+        </w:rPr>
+        <w:t xml:space="preserve"> It could also be healthier to buy locally, fresh higher-quality products without any chemicals that keeps them last longer. </w:t>
+      </w:r>
+      <w:r>
+        <w:rPr>
+          <w:rFonts w:ascii="Calibri" w:hAnsi="Calibri" w:cs="Calibri"/>
+          <w:color w:val="0D0D0D" w:themeColor="text1" w:themeTint="F2"/>
+        </w:rPr>
+        <w:t>Including this information in the solution, will encourage customers to buy locally and help small businesses, it will also enhance the user experience and lead to higher revenue.</w:t>
+      </w:r>
     </w:p>
     <w:p/>
     <w:p>
@@ -1413,6 +1421,7 @@
           <w:sz w:val="24"/>
           <w:szCs w:val="24"/>
         </w:rPr>
+        <w:lastRenderedPageBreak/>
         <w:br/>
         <w:t>Accessibility Features</w:t>
       </w:r>
@@ -1482,12 +1491,16 @@
     <w:p/>
     <w:p/>
     <w:p/>
+    <w:p/>
+    <w:p/>
+    <w:p/>
     <w:p>
       <w:pPr>
         <w:pStyle w:val="Heading1"/>
       </w:pPr>
-      <w:bookmarkStart w:id="2" w:name="_Toc223956245"/>
+      <w:bookmarkStart w:id="2" w:name="_Toc223961288"/>
       <w:r>
+        <w:lastRenderedPageBreak/>
         <w:t>Project Aim</w:t>
       </w:r>
       <w:bookmarkEnd w:id="2"/>
@@ -1610,7 +1623,6 @@
           <w:sz w:val="24"/>
           <w:szCs w:val="24"/>
         </w:rPr>
-        <w:lastRenderedPageBreak/>
         <w:t>provide a dashboard to enable producers to manage stock levels, update product details and view orders.</w:t>
       </w:r>
     </w:p>
@@ -1693,24 +1705,13 @@
     <w:p/>
     <w:p/>
     <w:p/>
-    <w:p/>
-    <w:p/>
-    <w:p/>
-    <w:p/>
-    <w:p/>
-    <w:p/>
-    <w:p/>
-    <w:p/>
-    <w:p/>
-    <w:p/>
-    <w:p/>
-    <w:p/>
     <w:p>
       <w:pPr>
         <w:pStyle w:val="Heading1"/>
       </w:pPr>
-      <w:bookmarkStart w:id="3" w:name="_Toc223956246"/>
+      <w:bookmarkStart w:id="3" w:name="_Toc223961289"/>
       <w:r>
+        <w:lastRenderedPageBreak/>
         <w:t>Functional Requirements</w:t>
       </w:r>
       <w:bookmarkEnd w:id="3"/>
@@ -1876,7 +1877,11 @@
           <w:tcPr>
             <w:tcW w:w="2689" w:type="dxa"/>
           </w:tcPr>
-          <w:p/>
+          <w:p>
+            <w:r>
+              <w:t>Log In</w:t>
+            </w:r>
+          </w:p>
         </w:tc>
         <w:tc>
           <w:tcPr>
@@ -1902,7 +1907,11 @@
           <w:tcPr>
             <w:tcW w:w="2689" w:type="dxa"/>
           </w:tcPr>
-          <w:p/>
+          <w:p>
+            <w:r>
+              <w:t>Register</w:t>
+            </w:r>
+          </w:p>
         </w:tc>
         <w:tc>
           <w:tcPr>
@@ -1928,7 +1937,11 @@
           <w:tcPr>
             <w:tcW w:w="2689" w:type="dxa"/>
           </w:tcPr>
-          <w:p/>
+          <w:p>
+            <w:r>
+              <w:t>Account Information</w:t>
+            </w:r>
+          </w:p>
         </w:tc>
         <w:tc>
           <w:tcPr>
@@ -1954,7 +1967,11 @@
           <w:tcPr>
             <w:tcW w:w="2689" w:type="dxa"/>
           </w:tcPr>
-          <w:p/>
+          <w:p>
+            <w:r>
+              <w:t>Order History</w:t>
+            </w:r>
+          </w:p>
         </w:tc>
         <w:tc>
           <w:tcPr>
@@ -1980,7 +1997,11 @@
           <w:tcPr>
             <w:tcW w:w="2689" w:type="dxa"/>
           </w:tcPr>
-          <w:p/>
+          <w:p>
+            <w:r>
+              <w:t>Product listings with pricing and availability</w:t>
+            </w:r>
+          </w:p>
         </w:tc>
         <w:tc>
           <w:tcPr>
@@ -2006,7 +2027,11 @@
           <w:tcPr>
             <w:tcW w:w="2689" w:type="dxa"/>
           </w:tcPr>
-          <w:p/>
+          <w:p>
+            <w:r>
+              <w:t>Order Placement, collection or delivery</w:t>
+            </w:r>
+          </w:p>
         </w:tc>
         <w:tc>
           <w:tcPr>
@@ -2032,7 +2057,11 @@
           <w:tcPr>
             <w:tcW w:w="2689" w:type="dxa"/>
           </w:tcPr>
-          <w:p/>
+          <w:p>
+            <w:r>
+              <w:t>Producer information and local benefits</w:t>
+            </w:r>
+          </w:p>
         </w:tc>
         <w:tc>
           <w:tcPr>
@@ -2053,6 +2082,159 @@
           <w:p/>
         </w:tc>
       </w:tr>
+      <w:tr>
+        <w:tc>
+          <w:tcPr>
+            <w:tcW w:w="2689" w:type="dxa"/>
+          </w:tcPr>
+          <w:p>
+            <w:r>
+              <w:t>Producer stock</w:t>
+            </w:r>
+          </w:p>
+        </w:tc>
+        <w:tc>
+          <w:tcPr>
+            <w:tcW w:w="1559" w:type="dxa"/>
+          </w:tcPr>
+          <w:p/>
+        </w:tc>
+        <w:tc>
+          <w:tcPr>
+            <w:tcW w:w="2514" w:type="dxa"/>
+          </w:tcPr>
+          <w:p/>
+        </w:tc>
+        <w:tc>
+          <w:tcPr>
+            <w:tcW w:w="2254" w:type="dxa"/>
+          </w:tcPr>
+          <w:p/>
+        </w:tc>
+      </w:tr>
+      <w:tr>
+        <w:tc>
+          <w:tcPr>
+            <w:tcW w:w="2689" w:type="dxa"/>
+          </w:tcPr>
+          <w:p>
+            <w:r>
+              <w:t>Product Management Dashboard</w:t>
+            </w:r>
+          </w:p>
+        </w:tc>
+        <w:tc>
+          <w:tcPr>
+            <w:tcW w:w="1559" w:type="dxa"/>
+          </w:tcPr>
+          <w:p/>
+        </w:tc>
+        <w:tc>
+          <w:tcPr>
+            <w:tcW w:w="2514" w:type="dxa"/>
+          </w:tcPr>
+          <w:p/>
+        </w:tc>
+        <w:tc>
+          <w:tcPr>
+            <w:tcW w:w="2254" w:type="dxa"/>
+          </w:tcPr>
+          <w:p/>
+        </w:tc>
+      </w:tr>
+      <w:tr>
+        <w:tc>
+          <w:tcPr>
+            <w:tcW w:w="2689" w:type="dxa"/>
+          </w:tcPr>
+          <w:p>
+            <w:r>
+              <w:t>Order Mana</w:t>
+            </w:r>
+            <w:r>
+              <w:t>gement</w:t>
+            </w:r>
+          </w:p>
+        </w:tc>
+        <w:tc>
+          <w:tcPr>
+            <w:tcW w:w="1559" w:type="dxa"/>
+          </w:tcPr>
+          <w:p/>
+        </w:tc>
+        <w:tc>
+          <w:tcPr>
+            <w:tcW w:w="2514" w:type="dxa"/>
+          </w:tcPr>
+          <w:p/>
+        </w:tc>
+        <w:tc>
+          <w:tcPr>
+            <w:tcW w:w="2254" w:type="dxa"/>
+          </w:tcPr>
+          <w:p/>
+        </w:tc>
+      </w:tr>
+      <w:tr>
+        <w:tc>
+          <w:tcPr>
+            <w:tcW w:w="2689" w:type="dxa"/>
+          </w:tcPr>
+          <w:p>
+            <w:r>
+              <w:t>Loyalty Scheme</w:t>
+            </w:r>
+          </w:p>
+        </w:tc>
+        <w:tc>
+          <w:tcPr>
+            <w:tcW w:w="1559" w:type="dxa"/>
+          </w:tcPr>
+          <w:p/>
+        </w:tc>
+        <w:tc>
+          <w:tcPr>
+            <w:tcW w:w="2514" w:type="dxa"/>
+          </w:tcPr>
+          <w:p/>
+        </w:tc>
+        <w:tc>
+          <w:tcPr>
+            <w:tcW w:w="2254" w:type="dxa"/>
+          </w:tcPr>
+          <w:p/>
+        </w:tc>
+      </w:tr>
+      <w:tr>
+        <w:tc>
+          <w:tcPr>
+            <w:tcW w:w="2689" w:type="dxa"/>
+          </w:tcPr>
+          <w:p>
+            <w:r>
+              <w:t>Accessibility Features</w:t>
+            </w:r>
+          </w:p>
+        </w:tc>
+        <w:tc>
+          <w:tcPr>
+            <w:tcW w:w="1559" w:type="dxa"/>
+          </w:tcPr>
+          <w:p/>
+        </w:tc>
+        <w:tc>
+          <w:tcPr>
+            <w:tcW w:w="2514" w:type="dxa"/>
+          </w:tcPr>
+          <w:p/>
+        </w:tc>
+        <w:tc>
+          <w:tcPr>
+            <w:tcW w:w="2254" w:type="dxa"/>
+          </w:tcPr>
+          <w:p/>
+        </w:tc>
+      </w:tr>
     </w:tbl>
     <w:p/>
     <w:p/>
@@ -2065,19 +2247,13 @@
     <w:p/>
     <w:p/>
     <w:p/>
-    <w:p/>
-    <w:p/>
-    <w:p/>
-    <w:p/>
-    <w:p/>
-    <w:p/>
-    <w:p/>
     <w:p>
       <w:pPr>
         <w:pStyle w:val="Heading1"/>
       </w:pPr>
-      <w:bookmarkStart w:id="4" w:name="_Toc223956247"/>
+      <w:bookmarkStart w:id="4" w:name="_Toc223961290"/>
       <w:r>
+        <w:lastRenderedPageBreak/>
         <w:t>Non-Functional Requirements</w:t>
       </w:r>
       <w:bookmarkEnd w:id="4"/>
@@ -2864,7 +3040,6 @@
                 <w:sz w:val="32"/>
                 <w:szCs w:val="32"/>
               </w:rPr>
-              <w:lastRenderedPageBreak/>
               <w:t>Accessibility</w:t>
             </w:r>
           </w:p>
@@ -2983,58 +3158,169 @@
     <w:p>
       <w:pPr>
         <w:pStyle w:val="Heading1"/>
-      </w:pPr>
-      <w:bookmarkStart w:id="5" w:name="_Toc223956248"/>
+        <w:spacing w:after="240"/>
+      </w:pPr>
+      <w:bookmarkStart w:id="5" w:name="_Toc223961291"/>
       <w:r>
+        <w:lastRenderedPageBreak/>
         <w:t>Hierarchy Diagram</w:t>
       </w:r>
       <w:bookmarkEnd w:id="5"/>
     </w:p>
     <w:p/>
-    <w:p/>
-    <w:p/>
-    <w:p/>
-    <w:p/>
-    <w:p/>
-    <w:p/>
-    <w:p/>
-    <w:p/>
-    <w:p/>
-    <w:p/>
-    <w:p/>
-    <w:p/>
     <w:p>
+      <w:r>
+        <w:rPr>
+          <w:noProof/>
+        </w:rPr>
+        <w:drawing>
+          <wp:inline distT="0" distB="0" distL="0" distR="0" wp14:anchorId="430B06B4" wp14:editId="434BE920">
+            <wp:extent cx="5731510" cy="3943985"/>
+            <wp:effectExtent l="0" t="0" r="2540" b="0"/>
+            <wp:docPr id="1" name="Picture 1"/>
+            <wp:cNvGraphicFramePr>
+              <a:graphicFrameLocks xmlns:a="http://schemas.openxmlformats.org/drawingml/2006/main" noChangeAspect="1"/>
+            </wp:cNvGraphicFramePr>
+            <a:graphic xmlns:a="http://schemas.openxmlformats.org/drawingml/2006/main">
+              <a:graphicData uri="http://schemas.openxmlformats.org/drawingml/2006/picture">
+                <pic:pic xmlns:pic="http://schemas.openxmlformats.org/drawingml/2006/picture">
+                  <pic:nvPicPr>
+                    <pic:cNvPr id="0" name="Picture 1"/>
+                    <pic:cNvPicPr>
+                      <a:picLocks noChangeAspect="1" noChangeArrowheads="1"/>
+                    </pic:cNvPicPr>
+                  </pic:nvPicPr>
+                  <pic:blipFill>
+                    <a:blip r:embed="rId8">
+                      <a:extLst>
+                        <a:ext uri="{28A0092B-C50C-407E-A947-70E740481C1C}">
+                          <a14:useLocalDpi xmlns:a14="http://schemas.microsoft.com/office/drawing/2010/main" val="0"/>
+                        </a:ext>
+                      </a:extLst>
+                    </a:blip>
+                    <a:srcRect/>
+                    <a:stretch>
+                      <a:fillRect/>
+                    </a:stretch>
+                  </pic:blipFill>
+                  <pic:spPr bwMode="auto">
+                    <a:xfrm>
+                      <a:off x="0" y="0"/>
+                      <a:ext cx="5731510" cy="3943985"/>
+                    </a:xfrm>
+                    <a:prstGeom prst="rect">
+                      <a:avLst/>
+                    </a:prstGeom>
+                    <a:noFill/>
+                    <a:ln>
+                      <a:noFill/>
+                    </a:ln>
+                  </pic:spPr>
+                </pic:pic>
+              </a:graphicData>
+            </a:graphic>
+          </wp:inline>
+        </w:drawing>
+      </w:r>
+    </w:p>
+    <w:p>
       <w:pPr>
         <w:pStyle w:val="Heading1"/>
       </w:pPr>
-      <w:bookmarkStart w:id="6" w:name="_Toc223956249"/>
+      <w:bookmarkStart w:id="6" w:name="_Toc223961292"/>
       <w:r>
         <w:t>UI Considerations</w:t>
       </w:r>
       <w:bookmarkEnd w:id="6"/>
     </w:p>
-    <w:p/>
-    <w:p/>
-    <w:p/>
-    <w:p/>
-    <w:p/>
-    <w:p/>
-    <w:p/>
-    <w:p/>
-    <w:p/>
-    <w:p/>
-    <w:p/>
-    <w:p/>
-    <w:p/>
-    <w:p/>
-    <w:p/>
-    <w:p/>
     <w:p>
       <w:pPr>
+        <w:spacing w:before="240"/>
+        <w:rPr>
+          <w:rFonts w:ascii="Calibri" w:hAnsi="Calibri" w:cs="Calibri"/>
+        </w:rPr>
+      </w:pPr>
+      <w:r>
+        <w:rPr>
+          <w:rFonts w:ascii="Calibri" w:hAnsi="Calibri" w:cs="Calibri"/>
+        </w:rPr>
+        <w:t xml:space="preserve">The digital </w:t>
+      </w:r>
+      <w:r>
+        <w:rPr>
+          <w:rFonts w:ascii="Calibri" w:hAnsi="Calibri" w:cs="Calibri"/>
+        </w:rPr>
+        <w:t xml:space="preserve">solution for Greenfield Local Hub must be developed in a professional way for it to represent the business well. The solution must be usable, visually appealing and industry standard. For the user to have a seamless experience the user interface must be </w:t>
+      </w:r>
+      <w:r>
+        <w:rPr>
+          <w:rFonts w:ascii="Calibri" w:hAnsi="Calibri" w:cs="Calibri"/>
+        </w:rPr>
+        <w:t>modern and clean</w:t>
+      </w:r>
+      <w:r>
+        <w:rPr>
+          <w:rFonts w:ascii="Calibri" w:hAnsi="Calibri" w:cs="Calibri"/>
+        </w:rPr>
+        <w:t xml:space="preserve"> without too much information on the pages which could lead to confused users. For the designing phase I have considered some key aspects which are the colour scheme, images, fonts and spacing. </w:t>
+      </w:r>
+      <w:r>
+        <w:rPr>
+          <w:rFonts w:ascii="Calibri" w:hAnsi="Calibri" w:cs="Calibri"/>
+        </w:rPr>
+        <w:t>First of all, the colour scheme I am planning to use is clean, industry standard and is connected to nature. The main colours I am using are dark green, white/cream, and a dark charcoal/brown colour.</w:t>
+      </w:r>
+    </w:p>
+    <w:p>
+      <w:pPr>
+        <w:rPr>
+          <w:rFonts w:ascii="Calibri" w:hAnsi="Calibri" w:cs="Calibri"/>
+        </w:rPr>
+      </w:pPr>
+    </w:p>
+    <w:p>
+      <w:pPr>
+        <w:rPr>
+          <w:rFonts w:ascii="Calibri" w:hAnsi="Calibri" w:cs="Calibri"/>
+        </w:rPr>
+      </w:pPr>
+    </w:p>
+    <w:p>
+      <w:pPr>
+        <w:rPr>
+          <w:rFonts w:ascii="Calibri" w:hAnsi="Calibri" w:cs="Calibri"/>
+        </w:rPr>
+      </w:pPr>
+    </w:p>
+    <w:p>
+      <w:pPr>
+        <w:rPr>
+          <w:rFonts w:ascii="Calibri" w:hAnsi="Calibri" w:cs="Calibri"/>
+        </w:rPr>
+      </w:pPr>
+    </w:p>
+    <w:p>
+      <w:pPr>
+        <w:rPr>
+          <w:rFonts w:ascii="Calibri" w:hAnsi="Calibri" w:cs="Calibri"/>
+        </w:rPr>
+      </w:pPr>
+    </w:p>
+    <w:p>
+      <w:pPr>
+        <w:rPr>
+          <w:rFonts w:ascii="Calibri" w:hAnsi="Calibri" w:cs="Calibri"/>
+        </w:rPr>
+      </w:pPr>
+    </w:p>
+    <w:p/>
+    <w:p>
+      <w:pPr>
         <w:pStyle w:val="Heading1"/>
       </w:pPr>
-      <w:bookmarkStart w:id="7" w:name="_Toc223956250"/>
+      <w:bookmarkStart w:id="7" w:name="_Toc223961293"/>
       <w:r>
+        <w:lastRenderedPageBreak/>
         <w:t>Security Considerations &amp; Risk Mitigation</w:t>
       </w:r>
       <w:bookmarkEnd w:id="7"/>
@@ -3045,7 +3331,7 @@
       <w:pPr>
         <w:pStyle w:val="Heading2"/>
       </w:pPr>
-      <w:bookmarkStart w:id="8" w:name="_Toc223956251"/>
+      <w:bookmarkStart w:id="8" w:name="_Toc223961294"/>
       <w:r>
         <w:t>Risk Matrix</w:t>
       </w:r>
@@ -3082,12 +3368,210 @@
       <w:pPr>
         <w:pStyle w:val="Heading1"/>
       </w:pPr>
-      <w:bookmarkStart w:id="9" w:name="_Toc223956252"/>
+      <w:bookmarkStart w:id="9" w:name="_Toc223961295"/>
       <w:r>
+        <w:lastRenderedPageBreak/>
         <w:t>Legal and Regulatory Guidelines</w:t>
       </w:r>
       <w:bookmarkEnd w:id="9"/>
     </w:p>
+    <w:p/>
+    <w:tbl>
+      <w:tblPr>
+        <w:tblStyle w:val="TableGrid"/>
+        <w:tblW w:w="0" w:type="auto"/>
+        <w:tblLook w:val="04A0" w:firstRow="1" w:lastRow="0" w:firstColumn="1" w:lastColumn="0" w:noHBand="0" w:noVBand="1"/>
+      </w:tblPr>
+      <w:tblGrid>
+        <w:gridCol w:w="3397"/>
+        <w:gridCol w:w="5619"/>
+      </w:tblGrid>
+      <w:tr>
+        <w:tc>
+          <w:tcPr>
+            <w:tcW w:w="3397" w:type="dxa"/>
+            <w:shd w:val="clear" w:color="auto" w:fill="323E4F" w:themeFill="text2" w:themeFillShade="BF"/>
+          </w:tcPr>
+          <w:p>
+            <w:pPr>
+              <w:jc w:val="center"/>
+              <w:rPr>
+                <w:b/>
+                <w:bCs/>
+                <w:color w:val="FFFFFF" w:themeColor="background1"/>
+                <w:sz w:val="28"/>
+                <w:szCs w:val="28"/>
+              </w:rPr>
+            </w:pPr>
+            <w:r>
+              <w:rPr>
+                <w:b/>
+                <w:bCs/>
+                <w:color w:val="FFFFFF" w:themeColor="background1"/>
+                <w:sz w:val="28"/>
+                <w:szCs w:val="28"/>
+              </w:rPr>
+              <w:t>Legislation</w:t>
+            </w:r>
+          </w:p>
+        </w:tc>
+        <w:tc>
+          <w:tcPr>
+            <w:tcW w:w="5619" w:type="dxa"/>
+            <w:shd w:val="clear" w:color="auto" w:fill="323E4F" w:themeFill="text2" w:themeFillShade="BF"/>
+          </w:tcPr>
+          <w:p>
+            <w:pPr>
+              <w:jc w:val="center"/>
+              <w:rPr>
+                <w:b/>
+                <w:bCs/>
+                <w:color w:val="FFFFFF" w:themeColor="background1"/>
+                <w:sz w:val="28"/>
+                <w:szCs w:val="28"/>
+              </w:rPr>
+            </w:pPr>
+            <w:r>
+              <w:rPr>
+                <w:b/>
+                <w:bCs/>
+                <w:color w:val="FFFFFF" w:themeColor="background1"/>
+                <w:sz w:val="28"/>
+                <w:szCs w:val="28"/>
+              </w:rPr>
+              <w:t>Application</w:t>
+            </w:r>
+          </w:p>
+        </w:tc>
+      </w:tr>
+      <w:tr>
+        <w:tc>
+          <w:tcPr>
+            <w:tcW w:w="3397" w:type="dxa"/>
+          </w:tcPr>
+          <w:p>
+            <w:r>
+              <w:t>GDPR / Data Protection Act 2018</w:t>
+            </w:r>
+          </w:p>
+        </w:tc>
+        <w:tc>
+          <w:tcPr>
+            <w:tcW w:w="5619" w:type="dxa"/>
+          </w:tcPr>
+          <w:p/>
+        </w:tc>
+      </w:tr>
+      <w:tr>
+        <w:tc>
+          <w:tcPr>
+            <w:tcW w:w="3397" w:type="dxa"/>
+          </w:tcPr>
+          <w:p>
+            <w:r>
+              <w:t>Consumer Rights Act 2015</w:t>
+            </w:r>
+          </w:p>
+        </w:tc>
+        <w:tc>
+          <w:tcPr>
+            <w:tcW w:w="5619" w:type="dxa"/>
+          </w:tcPr>
+          <w:p/>
+        </w:tc>
+      </w:tr>
+      <w:tr>
+        <w:tc>
+          <w:tcPr>
+            <w:tcW w:w="3397" w:type="dxa"/>
+          </w:tcPr>
+          <w:p>
+            <w:r>
+              <w:t>Consumer Protection from Unfair Trading Regulations 2008</w:t>
+            </w:r>
+          </w:p>
+        </w:tc>
+        <w:tc>
+          <w:tcPr>
+            <w:tcW w:w="5619" w:type="dxa"/>
+          </w:tcPr>
+          <w:p/>
+        </w:tc>
+      </w:tr>
+      <w:tr>
+        <w:tc>
+          <w:tcPr>
+            <w:tcW w:w="3397" w:type="dxa"/>
+          </w:tcPr>
+          <w:p>
+            <w:r>
+              <w:t>Electronic Commerce (EC Directive) Regulations 2002</w:t>
+            </w:r>
+          </w:p>
+        </w:tc>
+        <w:tc>
+          <w:tcPr>
+            <w:tcW w:w="5619" w:type="dxa"/>
+          </w:tcPr>
+          <w:p/>
+        </w:tc>
+      </w:tr>
+      <w:tr>
+        <w:tc>
+          <w:tcPr>
+            <w:tcW w:w="3397" w:type="dxa"/>
+          </w:tcPr>
+          <w:p>
+            <w:r>
+              <w:t>Equality Act 2010 &amp; Accessibility Standards WCAG</w:t>
+            </w:r>
+          </w:p>
+        </w:tc>
+        <w:tc>
+          <w:tcPr>
+            <w:tcW w:w="5619" w:type="dxa"/>
+          </w:tcPr>
+          <w:p/>
+        </w:tc>
+      </w:tr>
+      <w:tr>
+        <w:tc>
+          <w:tcPr>
+            <w:tcW w:w="3397" w:type="dxa"/>
+          </w:tcPr>
+          <w:p>
+            <w:r>
+              <w:t>General Food Law</w:t>
+            </w:r>
+          </w:p>
+        </w:tc>
+        <w:tc>
+          <w:tcPr>
+            <w:tcW w:w="5619" w:type="dxa"/>
+          </w:tcPr>
+          <w:p/>
+        </w:tc>
+      </w:tr>
+      <w:tr>
+        <w:tc>
+          <w:tcPr>
+            <w:tcW w:w="3397" w:type="dxa"/>
+          </w:tcPr>
+          <w:p>
+            <w:r>
+              <w:t>Food Information Regulations 2014</w:t>
+            </w:r>
+          </w:p>
+        </w:tc>
+        <w:tc>
+          <w:tcPr>
+            <w:tcW w:w="5619" w:type="dxa"/>
+          </w:tcPr>
+          <w:p/>
+        </w:tc>
+      </w:tr>
+    </w:tbl>
+    <w:p/>
     <w:sectPr>
       <w:pgSz w:w="11906" w:h="16838"/>
       <w:pgMar w:top="1440" w:right="1440" w:bottom="1440" w:left="1440" w:header="708" w:footer="708" w:gutter="0"/>
@@ -3919,6 +4403,18 @@
       <w:spacing w:val="15"/>
     </w:rPr>
   </w:style>
+  <w:style w:type="character" w:styleId="UnresolvedMention">
+    <w:name w:val="Unresolved Mention"/>
+    <w:basedOn w:val="DefaultParagraphFont"/>
+    <w:uiPriority w:val="99"/>
+    <w:semiHidden/>
+    <w:unhideWhenUsed/>
+    <w:rsid w:val="00BF3BC5"/>
+    <w:rPr>
+      <w:color w:val="605E5C"/>
+      <w:shd w:val="clear" w:color="auto" w:fill="E1DFDD"/>
+    </w:rPr>
+  </w:style>
 </w:styles>
 </file>
 
@@ -4056,7 +4552,7 @@
   </w:compat>
   <w:rsids>
     <w:rsidRoot w:val="00F9325C"/>
-    <w:rsid w:val="00BC352B"/>
+    <w:rsid w:val="00B03F3A"/>
     <w:rsid w:val="00F9325C"/>
   </w:rsids>
   <m:mathPr>

</xml_diff>